<commit_message>
fix(integration): Mẫu 10 in nội dung giải trình chênh lệch (APPRAISAL_EXPLANATION), cập nhật danh mục tag Mẫu 01/02/10
</commit_message>
<xml_diff>
--- a/backend/src/CongTacDang.Infrastructure/Templates/Word/Mau_10_PhieuThamDinh.docx
+++ b/backend/src/CongTacDang.Infrastructure/Templates/Word/Mau_10_PhieuThamDinh.docx
@@ -1620,7 +1620,28 @@
         <w:rPr>
           <w:sz w:val="24"/>
         </w:rPr>
-        <w:t>Nội dung giải trình của cá nhân (khi chênh lệch ≥ 5 điểm): ………………………………..</w:t>
+        <w:t xml:space="preserve">Nội dung giải trình của cá nhân (khi chênh lệch ≥ 5 điểm): </w:t>
+      </w:r>
+      <w:sdt>
+        <w:sdtPr>
+          <w:alias w:val="APPRAISAL_EXPLANATION"/>
+          <w:tag w:val="APPRAISAL_EXPLANATION"/>
+          <w:id w:val="510070"/>
+        </w:sdtPr>
+        <w:sdtContent>
+          <w:r>
+            <w:rPr>
+              <w:sz w:val="24"/>
+            </w:rPr>
+            <w:t xml:space="preserve"/>
+          </w:r>
+        </w:sdtContent>
+      </w:sdt>
+      <w:r>
+        <w:rPr>
+          <w:sz w:val="24"/>
+        </w:rPr>
+        <w:t xml:space="preserve">………………………………..</w:t>
       </w:r>
     </w:p>
     <w:p>

</xml_diff>

<commit_message>
feat(mau-10): tiêu đề Phiếu thẩm định là tên công ty và cơ quan thẩm định (mục mới "Cơ quan thẩm định" trong Thông tin đơn vị, để trống thì giữ chữ của biểu mẫu)
</commit_message>
<xml_diff>
--- a/backend/src/CongTacDang.Infrastructure/Templates/Word/Mau_10_PhieuThamDinh.docx
+++ b/backend/src/CongTacDang.Infrastructure/Templates/Word/Mau_10_PhieuThamDinh.docx
@@ -71,8 +71,8 @@
             </w:pPr>
             <w:sdt>
               <w:sdtPr>
-                <w:alias w:val="ORG_PARENT_COMPANY_NAME_UPPER"/>
-                <w:tag w:val="ORG_PARENT_COMPANY_NAME_UPPER"/>
+                <w:alias w:val="ORG_COMPANY_NAME_UPPER"/>
+                <w:tag w:val="ORG_COMPANY_NAME_UPPER"/>
                 <w:id w:val="531005"/>
               </w:sdtPr>
               <w:sdtContent>
@@ -81,7 +81,7 @@
                     <w:b/>
                     <w:sz w:val="24"/>
                   </w:rPr>
-                  <w:t>TỔNG CÔNG TY QUẢN LÝ BAY VIỆT NAM</w:t>
+                  <w:t>CÔNG TY …</w:t>
                 </w:r>
               </w:sdtContent>
             </w:sdt>
@@ -91,8 +91,23 @@
                 <w:sz w:val="24"/>
               </w:rPr>
               <w:br/>
-              <w:t>CƠ QUAN THẨM ĐỊNH</w:t>
             </w:r>
+            <w:sdt>
+              <w:sdtPr>
+                <w:alias w:val="ORG_APPRAISAL_UNIT_UPPER"/>
+                <w:tag w:val="ORG_APPRAISAL_UNIT_UPPER"/>
+                <w:id w:val="531090"/>
+              </w:sdtPr>
+              <w:sdtContent>
+                <w:r>
+                  <w:rPr>
+                    <w:b/>
+                    <w:sz w:val="24"/>
+                  </w:rPr>
+                  <w:t>CƠ QUAN THẨM ĐỊNH</w:t>
+                </w:r>
+              </w:sdtContent>
+            </w:sdt>
           </w:p>
         </w:tc>
         <w:tc>

</xml_diff>